<commit_message>
Enhance DOCX generation and processing
- Updated the MD_to_DOCX_Converter.py script to include post-processing for DOCX files.
- Added functionality to ensure tables have borders and are set to autofit.
- Implemented landscape orientation for documents containing tables.
- Ensured default font color is set to "auto" for better theme compatibility.
- Enhanced markdown table detection to improve DOCX output quality.
- Various binary DOCX files updated to reflect changes in documentation.
</commit_message>
<xml_diff>
--- a/docx/Automation/AUTOMATION_TEST_PLAN.docx
+++ b/docx/Automation/AUTOMATION_TEST_PLAN.docx
@@ -4405,8 +4405,16 @@
       <w:tblPr>
         <w:tblStyle w:val="Table"/>
         <w:tblW w:type="pct" w:w="5000"/>
-        <w:tblLayout w:type="fixed"/>
+        <w:tblLayout w:type="autofit"/>
         <w:tblLook w:firstRow="1" w:lastRow="0" w:firstColumn="0" w:lastColumn="0" w:noHBand="0" w:noVBand="0" w:val="0020"/>
+        <w:tblBorders>
+          <w:top w:val="single" w:sz="6" w:space="0" w:color="auto"/>
+          <w:left w:val="single" w:sz="6" w:space="0" w:color="auto"/>
+          <w:bottom w:val="single" w:sz="6" w:space="0" w:color="auto"/>
+          <w:right w:val="single" w:sz="6" w:space="0" w:color="auto"/>
+          <w:insideH w:val="single" w:sz="6" w:space="0" w:color="auto"/>
+          <w:insideV w:val="single" w:sz="6" w:space="0" w:color="auto"/>
+        </w:tblBorders>
       </w:tblPr>
       <w:tblGrid>
         <w:gridCol w:w="1320"/>
@@ -5692,6 +5700,7 @@
     <w:bookmarkEnd w:id="20"/>
     <w:bookmarkEnd w:id="21"/>
     <w:sectPr>
+      <w:pgSz w:w="16838" w:h="11906" w:orient="landscape"/>
       <w:footnotePr>
         <w:numRestart w:val="eachSect"/>
       </w:footnotePr>
@@ -5930,6 +5939,7 @@
   <w:docDefaults>
     <w:rPrDefault>
       <w:rPr>
+        <w:color w:val="auto"/>
         <w:rFonts w:asciiTheme="minorHAnsi" w:cstheme="minorBidi" w:eastAsiaTheme="minorEastAsia" w:hAnsiTheme="minorHAnsi"/>
         <w:sz w:val="24"/>
         <w:szCs w:val="24"/>

</xml_diff>

<commit_message>
Add initial reference document and related files
- Created a new reference document in DOCX format.
- Added necessary metadata and properties files for the document.
- Included footnotes, comments, and numbering configurations.
- Established document settings and styles for consistent formatting.
- Set up relationships for document components to ensure proper linking.
</commit_message>
<xml_diff>
--- a/docx/Automation/AUTOMATION_TEST_PLAN.docx
+++ b/docx/Automation/AUTOMATION_TEST_PLAN.docx
@@ -4405,15 +4405,15 @@
       <w:tblPr>
         <w:tblStyle w:val="Table"/>
         <w:tblW w:type="pct" w:w="5000"/>
-        <w:tblLayout w:type="autofit"/>
+        <w:tblLayout w:type="fixed"/>
         <w:tblLook w:firstRow="1" w:lastRow="0" w:firstColumn="0" w:lastColumn="0" w:noHBand="0" w:noVBand="0" w:val="0020"/>
         <w:tblBorders>
-          <w:top w:val="single" w:sz="6" w:space="0" w:color="auto"/>
-          <w:left w:val="single" w:sz="6" w:space="0" w:color="auto"/>
-          <w:bottom w:val="single" w:sz="6" w:space="0" w:color="auto"/>
-          <w:right w:val="single" w:sz="6" w:space="0" w:color="auto"/>
-          <w:insideH w:val="single" w:sz="6" w:space="0" w:color="auto"/>
-          <w:insideV w:val="single" w:sz="6" w:space="0" w:color="auto"/>
+          <w:top w:val="single" w:sz="6" w:space="0" w:color="808080"/>
+          <w:left w:val="single" w:sz="6" w:space="0" w:color="808080"/>
+          <w:bottom w:val="single" w:sz="6" w:space="0" w:color="808080"/>
+          <w:right w:val="single" w:sz="6" w:space="0" w:color="808080"/>
+          <w:insideH w:val="single" w:sz="6" w:space="0" w:color="808080"/>
+          <w:insideV w:val="single" w:sz="6" w:space="0" w:color="808080"/>
         </w:tblBorders>
       </w:tblPr>
       <w:tblGrid>
@@ -5939,7 +5939,6 @@
   <w:docDefaults>
     <w:rPrDefault>
       <w:rPr>
-        <w:color w:val="auto"/>
         <w:rFonts w:asciiTheme="minorHAnsi" w:cstheme="minorBidi" w:eastAsiaTheme="minorEastAsia" w:hAnsiTheme="minorHAnsi"/>
         <w:sz w:val="24"/>
         <w:szCs w:val="24"/>
@@ -6482,6 +6481,14 @@
         <w:bottom w:type="dxa" w:w="0"/>
         <w:right w:type="dxa" w:w="108"/>
       </w:tblCellMar>
+      <w:tblBorders>
+        <w:top w:color="auto" w:space="0" w:sz="6" w:val="single"/>
+        <w:left w:color="auto" w:space="0" w:sz="6" w:val="single"/>
+        <w:bottom w:color="auto" w:space="0" w:sz="6" w:val="single"/>
+        <w:right w:color="auto" w:space="0" w:sz="6" w:val="single"/>
+        <w:insideH w:color="auto" w:space="0" w:sz="6" w:val="single"/>
+        <w:insideV w:color="auto" w:space="0" w:sz="6" w:val="single"/>
+      </w:tblBorders>
     </w:tblPr>
     <w:tblStylePr w:type="firstRow">
       <w:tcPr>

</xml_diff>